<commit_message>
fix(registrar): keep the founders table's header and data row on one page
User-reported: the subscription table's header row printed at the foot of
one page with the founder row alone on the next. The root cause was not a
missing keep rule — both sources' founders tables are text-anchored
FLOATING tables (w:tblpPr), and a positioned table ignores every
pagination keep property: cantSplit and keepNext were set, Word's COM
reported them parsed, and five property experiments all split identically
until the anchor was found. The build now inlines the tables (their
centred position survives as a real w:jc), adds cantSplit to every row and
keepNext to the header row's paragraphs, and fails if a tblpPr ever
survives. Verified over COM: header and data row report the same page in
every founders table across the 1/2/5-founder samples, at unchanged page
counts (9/17/17); fidelity baselines unmoved.

Co-Authored-By: Claude Fable 5 <noreply@anthropic.com>
</commit_message>
<xml_diff>
--- a/assets/templates/company-registration-multi.docx
+++ b/assets/templates/company-registration-multi.docx
@@ -2066,7 +2066,6 @@
     </w:p>
     <w:tbl>
       <w:tblPr>
-        <w:tblpPr w:leftFromText="180" w:rightFromText="180" w:vertAnchor="text" w:horzAnchor="margin" w:tblpY="181"/>
         <w:tblW w:w="10885" w:type="dxa"/>
         <w:tblBorders>
           <w:top w:val="single" w:sz="4" w:space="0" w:color="auto"/>
@@ -2088,6 +2087,9 @@
         <w:gridCol w:w="2070"/>
       </w:tblGrid>
       <w:tr>
+        <w:trPr>
+          <w:cantSplit/>
+        </w:trPr>
         <w:tc>
           <w:tcPr>
             <w:tcW w:w="2335" w:type="dxa"/>
@@ -2095,6 +2097,7 @@
           </w:tcPr>
           <w:p>
             <w:pPr>
+              <w:keepNext/>
               <w:tabs>
                 <w:tab w:val="left" w:pos="720"/>
               </w:tabs>
@@ -2120,6 +2123,7 @@
           </w:p>
           <w:p>
             <w:pPr>
+              <w:keepNext/>
               <w:tabs>
                 <w:tab w:val="left" w:pos="720"/>
               </w:tabs>
@@ -2151,6 +2155,7 @@
           </w:tcPr>
           <w:p>
             <w:pPr>
+              <w:keepNext/>
               <w:tabs>
                 <w:tab w:val="left" w:pos="720"/>
               </w:tabs>
@@ -2174,6 +2179,7 @@
           </w:p>
           <w:p>
             <w:pPr>
+              <w:keepNext/>
               <w:tabs>
                 <w:tab w:val="left" w:pos="720"/>
               </w:tabs>
@@ -2203,6 +2209,7 @@
           </w:tcPr>
           <w:p>
             <w:pPr>
+              <w:keepNext/>
               <w:tabs>
                 <w:tab w:val="left" w:pos="720"/>
               </w:tabs>
@@ -2226,6 +2233,7 @@
           </w:p>
           <w:p>
             <w:pPr>
+              <w:keepNext/>
               <w:tabs>
                 <w:tab w:val="left" w:pos="720"/>
               </w:tabs>
@@ -2255,6 +2263,7 @@
           </w:tcPr>
           <w:p>
             <w:pPr>
+              <w:keepNext/>
               <w:tabs>
                 <w:tab w:val="left" w:pos="720"/>
               </w:tabs>
@@ -2280,6 +2289,7 @@
           </w:p>
           <w:p>
             <w:pPr>
+              <w:keepNext/>
               <w:tabs>
                 <w:tab w:val="left" w:pos="720"/>
               </w:tabs>
@@ -2305,6 +2315,7 @@
           </w:p>
           <w:p>
             <w:pPr>
+              <w:keepNext/>
               <w:tabs>
                 <w:tab w:val="left" w:pos="720"/>
               </w:tabs>
@@ -2336,6 +2347,7 @@
           </w:tcPr>
           <w:p>
             <w:pPr>
+              <w:keepNext/>
               <w:tabs>
                 <w:tab w:val="left" w:pos="720"/>
               </w:tabs>
@@ -2361,6 +2373,7 @@
           </w:p>
           <w:p>
             <w:pPr>
+              <w:keepNext/>
               <w:tabs>
                 <w:tab w:val="left" w:pos="720"/>
               </w:tabs>
@@ -2392,6 +2405,7 @@
           </w:tcPr>
           <w:p>
             <w:pPr>
+              <w:keepNext/>
               <w:tabs>
                 <w:tab w:val="left" w:pos="720"/>
               </w:tabs>
@@ -2417,6 +2431,7 @@
           </w:p>
           <w:p>
             <w:pPr>
+              <w:keepNext/>
               <w:tabs>
                 <w:tab w:val="left" w:pos="720"/>
               </w:tabs>
@@ -2444,6 +2459,7 @@
       </w:tr>
       <w:tr>
         <w:trPr>
+          <w:cantSplit/>
           <w:trHeight w:val="2897"/>
         </w:trPr>
         <w:tc>
@@ -8650,7 +8666,6 @@
     </w:p>
     <w:tbl>
       <w:tblPr>
-        <w:tblpPr w:leftFromText="180" w:rightFromText="180" w:vertAnchor="text" w:horzAnchor="margin" w:tblpY="181"/>
         <w:tblW w:w="10885" w:type="dxa"/>
         <w:tblBorders>
           <w:top w:val="single" w:sz="4" w:space="0" w:color="auto"/>
@@ -8672,6 +8687,9 @@
         <w:gridCol w:w="2070"/>
       </w:tblGrid>
       <w:tr>
+        <w:trPr>
+          <w:cantSplit/>
+        </w:trPr>
         <w:tc>
           <w:tcPr>
             <w:tcW w:w="2335" w:type="dxa"/>
@@ -8679,6 +8697,7 @@
           </w:tcPr>
           <w:p>
             <w:pPr>
+              <w:keepNext/>
               <w:tabs>
                 <w:tab w:val="left" w:pos="720"/>
               </w:tabs>
@@ -8704,6 +8723,7 @@
           </w:p>
           <w:p>
             <w:pPr>
+              <w:keepNext/>
               <w:tabs>
                 <w:tab w:val="left" w:pos="720"/>
               </w:tabs>
@@ -8735,6 +8755,7 @@
           </w:tcPr>
           <w:p>
             <w:pPr>
+              <w:keepNext/>
               <w:tabs>
                 <w:tab w:val="left" w:pos="720"/>
               </w:tabs>
@@ -8758,6 +8779,7 @@
           </w:p>
           <w:p>
             <w:pPr>
+              <w:keepNext/>
               <w:tabs>
                 <w:tab w:val="left" w:pos="720"/>
               </w:tabs>
@@ -8787,6 +8809,7 @@
           </w:tcPr>
           <w:p>
             <w:pPr>
+              <w:keepNext/>
               <w:tabs>
                 <w:tab w:val="left" w:pos="720"/>
               </w:tabs>
@@ -8810,6 +8833,7 @@
           </w:p>
           <w:p>
             <w:pPr>
+              <w:keepNext/>
               <w:tabs>
                 <w:tab w:val="left" w:pos="720"/>
               </w:tabs>
@@ -8839,6 +8863,7 @@
           </w:tcPr>
           <w:p>
             <w:pPr>
+              <w:keepNext/>
               <w:tabs>
                 <w:tab w:val="left" w:pos="720"/>
               </w:tabs>
@@ -8864,6 +8889,7 @@
           </w:p>
           <w:p>
             <w:pPr>
+              <w:keepNext/>
               <w:tabs>
                 <w:tab w:val="left" w:pos="720"/>
               </w:tabs>
@@ -8889,6 +8915,7 @@
           </w:p>
           <w:p>
             <w:pPr>
+              <w:keepNext/>
               <w:tabs>
                 <w:tab w:val="left" w:pos="720"/>
               </w:tabs>
@@ -8920,6 +8947,7 @@
           </w:tcPr>
           <w:p>
             <w:pPr>
+              <w:keepNext/>
               <w:tabs>
                 <w:tab w:val="left" w:pos="720"/>
               </w:tabs>
@@ -8945,6 +8973,7 @@
           </w:p>
           <w:p>
             <w:pPr>
+              <w:keepNext/>
               <w:tabs>
                 <w:tab w:val="left" w:pos="720"/>
               </w:tabs>
@@ -8976,6 +9005,7 @@
           </w:tcPr>
           <w:p>
             <w:pPr>
+              <w:keepNext/>
               <w:tabs>
                 <w:tab w:val="left" w:pos="720"/>
               </w:tabs>
@@ -9001,6 +9031,7 @@
           </w:p>
           <w:p>
             <w:pPr>
+              <w:keepNext/>
               <w:tabs>
                 <w:tab w:val="left" w:pos="720"/>
               </w:tabs>
@@ -9028,6 +9059,7 @@
       </w:tr>
       <w:tr>
         <w:trPr>
+          <w:cantSplit/>
           <w:trHeight w:val="2897"/>
         </w:trPr>
         <w:tc>

</xml_diff>

<commit_message>
fix(registrar): the declaration, founders table and drafter block travel as one unit
Second same-day report: with two founders the subscription table broke
between its founder rows, and the declaration paragraph (दफा १६/५३)
separated from its own table. The declaration now binds INTO the table
(keepNext on the last content paragraph before a founders table), every
row's paragraphs carry keepNext — the row loop copies them per founder,
chaining each founder row to the next — and the last row binds onward into
the मस्यौदाकार block, so the whole signature unit moves to a page whole.

Verified over COM: the unit sits on ONE page in the single and 2-founder
samples (both reported cases); a 5-founder unit legitimately spans pages —
the same 'genuinely too long' exception the numbered points follow. Page
counts now 9 / 18 / 22, asserted in wordPages.ps1.

Co-Authored-By: Claude Fable 5 <noreply@anthropic.com>
</commit_message>
<xml_diff>
--- a/assets/templates/company-registration-multi.docx
+++ b/assets/templates/company-registration-multi.docx
@@ -2100,6 +2100,7 @@
     </w:p>
     <w:p>
       <w:pPr>
+        <w:keepNext/>
         <w:keepLines/>
         <w:tabs>
           <w:tab w:val="left" w:pos="480"/>
@@ -2579,12 +2580,16 @@
             <w:tcW w:w="2335" w:type="dxa"/>
           </w:tcPr>
           <w:p>
+            <w:pPr>
+              <w:keepNext/>
+            </w:pPr>
             <w:r>
               <w:t>{{#founders}}</w:t>
             </w:r>
           </w:p>
           <w:p>
             <w:pPr>
+              <w:keepNext/>
               <w:spacing w:line="264" w:lineRule="auto"/>
               <w:jc w:val="both"/>
               <w:rPr>
@@ -2607,6 +2612,7 @@
           </w:p>
           <w:p>
             <w:pPr>
+              <w:keepNext/>
               <w:spacing w:line="264" w:lineRule="auto"/>
               <w:jc w:val="both"/>
               <w:rPr>
@@ -2628,6 +2634,7 @@
           </w:p>
           <w:p>
             <w:pPr>
+              <w:keepNext/>
               <w:spacing w:line="264" w:lineRule="auto"/>
               <w:jc w:val="both"/>
               <w:rPr>
@@ -2650,6 +2657,7 @@
           <w:p>
             <w:pPr>
               <w:spacing w:after="0" w:line="240" w:lineRule="auto"/>
+              <w:keepNext/>
               <w:jc w:val="both"/>
               <w:rPr>
                 <w:rFonts w:ascii="Nirmala UI" w:hAnsi="Nirmala UI"/>
@@ -2662,6 +2670,7 @@
           <w:p>
             <w:pPr>
               <w:spacing w:after="0" w:line="240" w:lineRule="auto"/>
+              <w:keepNext/>
               <w:jc w:val="both"/>
               <w:rPr>
                 <w:rFonts w:ascii="Nirmala UI" w:hAnsi="Nirmala UI"/>
@@ -2673,6 +2682,7 @@
           </w:p>
           <w:p>
             <w:pPr>
+              <w:keepNext/>
               <w:rPr>
                 <w:rFonts w:ascii="Nirmala UI" w:hAnsi="Nirmala UI"/>
                 <w:sz w:val="22"/>
@@ -2691,6 +2701,7 @@
           <w:p>
             <w:pPr>
               <w:spacing w:after="0" w:line="240" w:lineRule="auto"/>
+              <w:keepNext/>
               <w:rPr>
                 <w:rFonts w:ascii="Nirmala UI" w:hAnsi="Nirmala UI"/>
                 <w:sz w:val="16"/>
@@ -2701,6 +2712,7 @@
           <w:p>
             <w:pPr>
               <w:spacing w:after="0" w:line="240" w:lineRule="auto"/>
+              <w:keepNext/>
               <w:rPr>
                 <w:rFonts w:ascii="Nirmala UI" w:hAnsi="Nirmala UI"/>
                 <w:sz w:val="16"/>
@@ -2711,6 +2723,7 @@
           <w:p>
             <w:pPr>
               <w:spacing w:after="0" w:line="240" w:lineRule="auto"/>
+              <w:keepNext/>
               <w:rPr>
                 <w:rFonts w:ascii="Nirmala UI" w:hAnsi="Nirmala UI"/>
                 <w:sz w:val="16"/>
@@ -2725,6 +2738,7 @@
           </w:tcPr>
           <w:p>
             <w:pPr>
+              <w:keepNext/>
               <w:rPr>
                 <w:sz w:val="22"/>
                 <w:szCs w:val="22"/>
@@ -2747,6 +2761,7 @@
           </w:tcPr>
           <w:p>
             <w:pPr>
+              <w:keepNext/>
               <w:rPr>
                 <w:rFonts w:ascii="Nirmala UI" w:hAnsi="Nirmala UI"/>
                 <w:color w:val="000000"/>
@@ -2766,6 +2781,7 @@
           </w:p>
           <w:p>
             <w:pPr>
+              <w:keepNext/>
               <w:rPr>
                 <w:rFonts w:ascii="Nirmala UI" w:hAnsi="Nirmala UI"/>
                 <w:color w:val="000000"/>
@@ -2785,6 +2801,7 @@
           </w:p>
           <w:p>
             <w:pPr>
+              <w:keepNext/>
               <w:rPr>
                 <w:rFonts w:ascii="Nirmala UI" w:hAnsi="Nirmala UI"/>
                 <w:color w:val="000000"/>
@@ -2805,6 +2822,7 @@
           <w:p>
             <w:pPr>
               <w:spacing w:after="0" w:line="240" w:lineRule="auto"/>
+              <w:keepNext/>
               <w:rPr>
                 <w:rFonts w:ascii="Nirmala UI" w:hAnsi="Nirmala UI"/>
                 <w:sz w:val="16"/>
@@ -2819,6 +2837,7 @@
           </w:tcPr>
           <w:p>
             <w:pPr>
+              <w:keepNext/>
               <w:rPr>
                 <w:rFonts w:ascii="Nirmala UI" w:hAnsi="Nirmala UI"/>
                 <w:sz w:val="22"/>
@@ -2836,6 +2855,7 @@
           </w:p>
           <w:p>
             <w:pPr>
+              <w:keepNext/>
               <w:rPr>
                 <w:rFonts w:ascii="Nirmala UI" w:hAnsi="Nirmala UI"/>
                 <w:sz w:val="22"/>
@@ -2858,6 +2878,7 @@
           </w:tcPr>
           <w:p>
             <w:pPr>
+              <w:keepNext/>
               <w:jc w:val="both"/>
               <w:rPr>
                 <w:rFonts w:ascii="Nirmala UI" w:hAnsi="Nirmala UI"/>
@@ -2877,6 +2898,7 @@
           <w:p>
             <w:pPr>
               <w:spacing w:after="0" w:line="240" w:lineRule="auto"/>
+              <w:keepNext/>
               <w:jc w:val="both"/>
               <w:rPr>
                 <w:rFonts w:ascii="Nirmala UI" w:hAnsi="Nirmala UI"/>
@@ -2887,6 +2909,7 @@
           </w:p>
           <w:p>
             <w:pPr>
+              <w:keepNext/>
               <w:rPr>
                 <w:rFonts w:ascii="Nirmala UI" w:hAnsi="Nirmala UI"/>
                 <w:sz w:val="22"/>
@@ -2904,6 +2927,7 @@
           </w:p>
           <w:p>
             <w:pPr>
+              <w:keepNext/>
               <w:spacing w:line="264" w:lineRule="auto"/>
               <w:rPr>
                 <w:rFonts w:ascii="Nirmala UI" w:hAnsi="Nirmala UI"/>
@@ -2925,6 +2949,7 @@
           <w:p>
             <w:pPr>
               <w:spacing w:after="0" w:line="240" w:lineRule="auto"/>
+              <w:keepNext/>
               <w:rPr>
                 <w:rFonts w:ascii="Nirmala UI" w:hAnsi="Nirmala UI"/>
                 <w:sz w:val="16"/>
@@ -2936,6 +2961,7 @@
           <w:p>
             <w:pPr>
               <w:spacing w:after="0" w:line="240" w:lineRule="auto"/>
+              <w:keepNext/>
               <w:rPr>
                 <w:rFonts w:ascii="Nirmala UI" w:hAnsi="Nirmala UI"/>
                 <w:sz w:val="16"/>
@@ -2946,6 +2972,7 @@
           </w:p>
           <w:p>
             <w:pPr>
+              <w:keepNext/>
               <w:spacing w:line="264" w:lineRule="auto"/>
               <w:rPr>
                 <w:rFonts w:ascii="Nirmala UI" w:hAnsi="Nirmala UI"/>
@@ -2969,6 +2996,7 @@
           </w:tcPr>
           <w:p>
             <w:pPr>
+              <w:keepNext/>
               <w:rPr>
                 <w:rFonts w:ascii="Nirmala UI" w:hAnsi="Nirmala UI"/>
                 <w:sz w:val="22"/>
@@ -2987,6 +3015,7 @@
           <w:p>
             <w:pPr>
               <w:spacing w:after="0" w:line="240" w:lineRule="auto"/>
+              <w:keepNext/>
               <w:rPr>
                 <w:rFonts w:ascii="Nirmala UI" w:hAnsi="Nirmala UI"/>
                 <w:sz w:val="16"/>
@@ -2996,6 +3025,7 @@
           </w:p>
           <w:p>
             <w:pPr>
+              <w:keepNext/>
               <w:rPr>
                 <w:rFonts w:ascii="Nirmala UI" w:hAnsi="Nirmala UI"/>
                 <w:sz w:val="22"/>
@@ -3012,6 +3042,9 @@
             </w:r>
           </w:p>
           <w:p>
+            <w:pPr>
+              <w:keepNext/>
+            </w:pPr>
             <w:r>
               <w:t>{{/founders}}</w:t>
             </w:r>
@@ -8988,6 +9021,7 @@
     </w:p>
     <w:p>
       <w:pPr>
+        <w:keepNext/>
         <w:keepLines/>
         <w:tabs>
           <w:tab w:val="left" w:pos="480"/>
@@ -9476,12 +9510,16 @@
             <w:tcW w:w="2335" w:type="dxa"/>
           </w:tcPr>
           <w:p>
+            <w:pPr>
+              <w:keepNext/>
+            </w:pPr>
             <w:r>
               <w:t>{{#founders}}</w:t>
             </w:r>
           </w:p>
           <w:p>
             <w:pPr>
+              <w:keepNext/>
               <w:spacing w:line="264" w:lineRule="auto"/>
               <w:jc w:val="both"/>
               <w:rPr>
@@ -9504,6 +9542,7 @@
           </w:p>
           <w:p>
             <w:pPr>
+              <w:keepNext/>
               <w:spacing w:line="264" w:lineRule="auto"/>
               <w:jc w:val="both"/>
               <w:rPr>
@@ -9525,6 +9564,7 @@
           </w:p>
           <w:p>
             <w:pPr>
+              <w:keepNext/>
               <w:spacing w:line="264" w:lineRule="auto"/>
               <w:jc w:val="both"/>
               <w:rPr>
@@ -9546,6 +9586,7 @@
           </w:p>
           <w:p>
             <w:pPr>
+              <w:keepNext/>
               <w:rPr>
                 <w:rFonts w:ascii="Nirmala UI" w:hAnsi="Nirmala UI"/>
                 <w:sz w:val="22"/>
@@ -9564,6 +9605,7 @@
           <w:p>
             <w:pPr>
               <w:spacing w:after="0" w:line="240" w:lineRule="auto"/>
+              <w:keepNext/>
               <w:rPr>
                 <w:rFonts w:ascii="Nirmala UI" w:hAnsi="Nirmala UI"/>
                 <w:sz w:val="16"/>
@@ -9574,6 +9616,7 @@
           <w:p>
             <w:pPr>
               <w:spacing w:after="0" w:line="240" w:lineRule="auto"/>
+              <w:keepNext/>
               <w:rPr>
                 <w:rFonts w:ascii="Nirmala UI" w:hAnsi="Nirmala UI"/>
                 <w:sz w:val="16"/>
@@ -9584,6 +9627,7 @@
           <w:p>
             <w:pPr>
               <w:spacing w:after="0" w:line="240" w:lineRule="auto"/>
+              <w:keepNext/>
               <w:rPr>
                 <w:rFonts w:ascii="Nirmala UI" w:hAnsi="Nirmala UI"/>
                 <w:sz w:val="16"/>
@@ -9594,6 +9638,7 @@
           <w:p>
             <w:pPr>
               <w:spacing w:after="0" w:line="240" w:lineRule="auto"/>
+              <w:keepNext/>
               <w:rPr>
                 <w:rFonts w:ascii="Nirmala UI" w:hAnsi="Nirmala UI"/>
                 <w:sz w:val="16"/>
@@ -9608,6 +9653,7 @@
           </w:tcPr>
           <w:p>
             <w:pPr>
+              <w:keepNext/>
               <w:rPr>
                 <w:sz w:val="22"/>
                 <w:szCs w:val="22"/>
@@ -9630,6 +9676,7 @@
           </w:tcPr>
           <w:p>
             <w:pPr>
+              <w:keepNext/>
               <w:rPr>
                 <w:rFonts w:ascii="Nirmala UI" w:hAnsi="Nirmala UI"/>
                 <w:color w:val="000000"/>
@@ -9649,6 +9696,7 @@
           </w:p>
           <w:p>
             <w:pPr>
+              <w:keepNext/>
               <w:rPr>
                 <w:rFonts w:ascii="Nirmala UI" w:hAnsi="Nirmala UI"/>
                 <w:color w:val="000000"/>
@@ -9668,6 +9716,7 @@
           </w:p>
           <w:p>
             <w:pPr>
+              <w:keepNext/>
               <w:rPr>
                 <w:rFonts w:ascii="Nirmala UI" w:hAnsi="Nirmala UI"/>
                 <w:color w:val="000000"/>
@@ -9688,6 +9737,7 @@
           <w:p>
             <w:pPr>
               <w:spacing w:after="0" w:line="240" w:lineRule="auto"/>
+              <w:keepNext/>
               <w:rPr>
                 <w:rFonts w:ascii="Nirmala UI" w:hAnsi="Nirmala UI"/>
                 <w:sz w:val="16"/>
@@ -9702,6 +9752,7 @@
           </w:tcPr>
           <w:p>
             <w:pPr>
+              <w:keepNext/>
               <w:rPr>
                 <w:rFonts w:ascii="Nirmala UI" w:hAnsi="Nirmala UI"/>
                 <w:sz w:val="22"/>
@@ -9719,6 +9770,7 @@
           </w:p>
           <w:p>
             <w:pPr>
+              <w:keepNext/>
               <w:rPr>
                 <w:rFonts w:ascii="Nirmala UI" w:hAnsi="Nirmala UI"/>
                 <w:sz w:val="22"/>
@@ -9741,6 +9793,7 @@
           </w:tcPr>
           <w:p>
             <w:pPr>
+              <w:keepNext/>
               <w:jc w:val="both"/>
               <w:rPr>
                 <w:rFonts w:ascii="Nirmala UI" w:hAnsi="Nirmala UI"/>
@@ -9760,6 +9813,7 @@
           <w:p>
             <w:pPr>
               <w:spacing w:after="0" w:line="240" w:lineRule="auto"/>
+              <w:keepNext/>
               <w:jc w:val="both"/>
               <w:rPr>
                 <w:rFonts w:ascii="Nirmala UI" w:hAnsi="Nirmala UI"/>
@@ -9770,6 +9824,7 @@
           </w:p>
           <w:p>
             <w:pPr>
+              <w:keepNext/>
               <w:rPr>
                 <w:rFonts w:ascii="Nirmala UI" w:hAnsi="Nirmala UI"/>
                 <w:sz w:val="22"/>
@@ -9787,6 +9842,7 @@
           </w:p>
           <w:p>
             <w:pPr>
+              <w:keepNext/>
               <w:spacing w:line="264" w:lineRule="auto"/>
               <w:rPr>
                 <w:rFonts w:ascii="Nirmala UI" w:hAnsi="Nirmala UI"/>
@@ -9808,6 +9864,7 @@
           <w:p>
             <w:pPr>
               <w:spacing w:after="0" w:line="240" w:lineRule="auto"/>
+              <w:keepNext/>
               <w:rPr>
                 <w:rFonts w:ascii="Nirmala UI" w:hAnsi="Nirmala UI"/>
                 <w:sz w:val="16"/>
@@ -9819,6 +9876,7 @@
           <w:p>
             <w:pPr>
               <w:spacing w:after="0" w:line="240" w:lineRule="auto"/>
+              <w:keepNext/>
               <w:rPr>
                 <w:rFonts w:ascii="Nirmala UI" w:hAnsi="Nirmala UI"/>
                 <w:sz w:val="16"/>
@@ -9829,6 +9887,7 @@
           </w:p>
           <w:p>
             <w:pPr>
+              <w:keepNext/>
               <w:spacing w:line="264" w:lineRule="auto"/>
               <w:rPr>
                 <w:rFonts w:ascii="Nirmala UI" w:hAnsi="Nirmala UI"/>
@@ -9852,6 +9911,7 @@
           </w:tcPr>
           <w:p>
             <w:pPr>
+              <w:keepNext/>
               <w:rPr>
                 <w:rFonts w:ascii="Nirmala UI" w:hAnsi="Nirmala UI"/>
                 <w:sz w:val="22"/>
@@ -9870,6 +9930,7 @@
           <w:p>
             <w:pPr>
               <w:spacing w:after="0" w:line="240" w:lineRule="auto"/>
+              <w:keepNext/>
               <w:rPr>
                 <w:rFonts w:ascii="Nirmala UI" w:hAnsi="Nirmala UI"/>
                 <w:sz w:val="16"/>
@@ -9879,6 +9940,7 @@
           </w:p>
           <w:p>
             <w:pPr>
+              <w:keepNext/>
               <w:rPr>
                 <w:rFonts w:ascii="Nirmala UI" w:hAnsi="Nirmala UI"/>
                 <w:sz w:val="22"/>
@@ -9895,6 +9957,9 @@
             </w:r>
           </w:p>
           <w:p>
+            <w:pPr>
+              <w:keepNext/>
+            </w:pPr>
             <w:r>
               <w:t>{{/founders}}</w:t>
             </w:r>

</xml_diff>